<commit_message>
fix(placement-financier): corrige la leçon 15 et durcit le prompt (A2, C1, E bis) ; ㉙ passe B-NOM — une affirmation sans guillemets prêtée à un nom se cherche mot par mot sur ses pages
Co-Authored-By: Claude Opus 5 <noreply@anthropic.com>
</commit_message>
<xml_diff>
--- a/livrables/lecons/2026-09-19_lecon-placement-financier_15_biais-comportementaux-epargnant.docx
+++ b/livrables/lecons/2026-09-19_lecon-placement-financier_15_biais-comportementaux-epargnant.docx
@@ -370,7 +370,18 @@
                 <w:sz w:val="20"/>
                 <w:szCs w:val="20"/>
               </w:rPr>
-              <w:t xml:space="preserve">La douleur psychologique d'une perte est environ deux fois plus intense que le plaisir d'un gain équivalent. Conséquence : on préfère garder un placement en perte plutôt que de le vendre pour réinvestir, ou on laisse l'épargne en liquidités par peur de perdre.</w:t>
+              <w:t xml:space="preserve">La douleur psychologique d'une perte est nettement plus intense que le plaisir d'un gain équivalent — les travaux de Kahneman et Tversky en mesurent l'ordre de grandeur, mais aucune des pages consultées pour cette leçon ne porte ce coefficient : il n'est donc pas chiffré ici. Conséquence : on préfère garder un placement en perte plutôt que de le vendre pour réinvestir, ou on laisse l'épargne en liquidités par peur de perdre. </w:t>
+            </w:r>
+            <w:r>
+              <w:rPr>
+                <w:rFonts w:ascii="Times New Roman" w:cs="Times New Roman" w:eastAsia="Times New Roman" w:hAnsi="Times New Roman"/>
+                <w:i/>
+                <w:iCs/>
+                <w:color w:val="6B7280"/>
+                <w:sz w:val="18"/>
+                <w:szCs w:val="18"/>
+              </w:rPr>
+              <w:t xml:space="preserve">[Corrigé le 19/09/2026 : « environ deux fois plus intense » était le seul chiffre de la leçon sans source consultée.]</w:t>
             </w:r>
           </w:p>
         </w:tc>
@@ -1126,7 +1137,18 @@
           <w:sz w:val="22"/>
           <w:szCs w:val="22"/>
         </w:rPr>
-        <w:t xml:space="preserve">Corrigé proposé — A : aversion aux pertes (le prix d'ancrage de 200 € bloque la décision rationnelle de réallouer). B : excès de confiance (surestimation de sa capacité à sélectionner des titres gagnants). C : biais de disponibilité (la saillance médiatique de la faillite surestime la probabilité de perte sur tous les actifs). D : biais de confirmation (sélection des informations qui valident une décision préexistante). E : biais rétrospectif (conviction rétrospective d'avoir anticipé la hausse, alimentant l'excès de confiance pour les décisions futures).</w:t>
+        <w:t xml:space="preserve">Corrigé proposé — A : deux biais ensemble — aversion aux pertes (vendre reviendrait à « réaliser » la perte) ET biais d'ancrage (le prix d'achat de 200 € sert de référence alors qu'il n'a aucune incidence sur la valeur future) ; c'est ce que la finance comportementale appelle l'effet de disposition, et la ligne « ancrage » du tableau de théorie décrit exactement ce cas. Les deux réponses sont justes, la meilleure les nomme toutes deux. B : excès de confiance (surestimation de sa capacité à sélectionner des titres gagnants). C : biais de disponibilité (la saillance médiatique de la faillite surestime la probabilité de perte sur tous les actifs). D : biais de confirmation (sélection des informations qui valident une décision préexistante). E : biais rétrospectif (conviction rétrospective d'avoir anticipé la hausse, alimentant l'excès de confiance pour les décisions futures). </w:t>
+      </w:r>
+      <w:r>
+        <w:rPr>
+          <w:rFonts w:ascii="Times New Roman" w:cs="Times New Roman" w:eastAsia="Times New Roman" w:hAnsi="Times New Roman"/>
+          <w:i/>
+          <w:iCs/>
+          <w:color w:val="6B7280"/>
+          <w:sz w:val="20"/>
+          <w:szCs w:val="20"/>
+        </w:rPr>
+        <w:t xml:space="preserve">[Corrigé le 19/09/2026 : le corrigé ne nommait que l'aversion aux pertes, en l'expliquant par le mécanisme de l'ancrage ; le tableau de théorie donnait l'autre réponse.]</w:t>
       </w:r>
     </w:p>
     <w:p>
@@ -1579,7 +1601,18 @@
           <w:sz w:val="22"/>
           <w:szCs w:val="22"/>
         </w:rPr>
-        <w:t xml:space="preserve">Piste de corrigé — Les biais les plus courants en France, selon la littérature sur le comportement des épargnants (IEFP), sont l'aversion aux pertes (surtout chez les épargnants peu familiers des marchés), le biais de confirmation (sur les supports les plus médiatisés), et l'effet moutonnier lors des phases de marché extrêmes. Il n'existe pas de profil universel : l'objectif de ce challenge est de te doter d'un outil d'auto-observation, pas d'un diagnostic.</w:t>
+        <w:t xml:space="preserve">Piste de corrigé — Ce que la page de l'IEFP consultée pour cette leçon dit des épargnants français : absence fréquente de détention d'actions (en direct ou via OPC et unités de compte), diversification très insuffisante, mémoire sélective, pertes qui marquent plus que les gains, tendance à prolonger les tendances de court terme, biais de familiarité et biais de confirmation. Elle ne classe pas ces biais par fréquence, et ne parle pas d'effet moutonnier — celui-ci vient de la page Yomoni. Il n'existe pas de profil universel : l'objectif de ce challenge est de te doter d'un outil d'auto-observation, pas d'un diagnostic. </w:t>
+      </w:r>
+      <w:r>
+        <w:rPr>
+          <w:rFonts w:ascii="Times New Roman" w:cs="Times New Roman" w:eastAsia="Times New Roman" w:hAnsi="Times New Roman"/>
+          <w:i/>
+          <w:iCs/>
+          <w:color w:val="6B7280"/>
+          <w:sz w:val="20"/>
+          <w:szCs w:val="20"/>
+        </w:rPr>
+        <w:t xml:space="preserve">[Corrigé le 19/09/2026 : la première version prêtait à l'IEFP une hiérarchie — aversion aux pertes, confirmation, effet moutonnier, avec trois précisions — que sa page ne pose pas ; « moutonnier » n'y figure pas.]</w:t>
       </w:r>
     </w:p>
     <w:p>
@@ -1789,7 +1822,18 @@
           <w:sz w:val="22"/>
           <w:szCs w:val="22"/>
         </w:rPr>
-        <w:t xml:space="preserve"> — présentation pédagogique des 7 biais principaux avec exemples concrets. ⚠️ Source secondaire : Yomoni est une société de gestion ; consulter en complément des sources officielles.</w:t>
+        <w:t xml:space="preserve"> — sept biais avec exemples concrets, dont six des sept de cette leçon (Yomoni traite du biais d'information, pas du biais de disponibilité ; article daté du 16 août 2022). ⚠️ Source secondaire : Yomoni est une société de gestion ; consulter en complément des sources officielles.</w:t>
+      </w:r>
+      <w:r>
+        <w:rPr>
+          <w:rFonts w:ascii="Times New Roman" w:cs="Times New Roman" w:eastAsia="Times New Roman" w:hAnsi="Times New Roman"/>
+          <w:i/>
+          <w:iCs/>
+          <w:color w:val="6B7280"/>
+          <w:sz w:val="20"/>
+          <w:szCs w:val="20"/>
+        </w:rPr>
+        <w:t xml:space="preserve"> [Corrigé le 19/09/2026 : le libellé disait « les 7 biais principaux » ; les sept de Yomoni ne sont pas les sept de la leçon.]</w:t>
       </w:r>
     </w:p>
     <w:p>
@@ -2001,6 +2045,93 @@
           <w:szCs w:val="22"/>
         </w:rPr>
         <w:t xml:space="preserve">Thèmes abordés : donation, succession, usufruit et nue-propriété, démembrement de contrat d'assurance-vie, abattements fiscaux, pacte Dutreil. Pertinent dans la perspective d'un horizon de placement de 7-8 ans : anticiper la transmission est une composante intégrante de la gestion patrimoniale de moyen terme.</w:t>
+      </w:r>
+    </w:p>
+    <w:p>
+      <w:pPr>
+        <w:pStyle w:val="Heading2"/>
+        <w:spacing w:after="100" w:before="280"/>
+      </w:pPr>
+      <w:r>
+        <w:rPr>
+          <w:rFonts w:ascii="Times New Roman" w:cs="Times New Roman" w:eastAsia="Times New Roman" w:hAnsi="Times New Roman"/>
+          <w:b/>
+          <w:bCs/>
+          <w:color w:val="1B3A6B"/>
+          <w:sz w:val="30"/>
+          <w:szCs w:val="30"/>
+        </w:rPr>
+        <w:t xml:space="preserve">📝 Journal des corrections (19/09/2026)</w:t>
+      </w:r>
+    </w:p>
+    <w:p>
+      <w:pPr>
+        <w:spacing w:after="40" w:before="60"/>
+      </w:pPr>
+      <w:r>
+        <w:rPr>
+          <w:rFonts w:ascii="Times New Roman" w:cs="Times New Roman" w:eastAsia="Times New Roman" w:hAnsi="Times New Roman"/>
+          <w:color w:val="1F2937"/>
+          <w:sz w:val="22"/>
+          <w:szCs w:val="22"/>
+        </w:rPr>
+        <w:t xml:space="preserve">Relecture du 19/09/2026, chaque point vérifié sur les pages citées. Les corrections sont intégrées ci-dessus avec un marqueur daté ; ce journal garde la formulation d'origine.</w:t>
+      </w:r>
+    </w:p>
+    <w:p>
+      <w:pPr>
+        <w:spacing w:after="40" w:before="60"/>
+      </w:pPr>
+      <w:r>
+        <w:rPr>
+          <w:rFonts w:ascii="Times New Roman" w:cs="Times New Roman" w:eastAsia="Times New Roman" w:hAnsi="Times New Roman"/>
+          <w:color w:val="1F2937"/>
+          <w:sz w:val="22"/>
+          <w:szCs w:val="22"/>
+        </w:rPr>
+        <w:t xml:space="preserve">• Tableau, aversion aux pertes : « La douleur psychologique d'une perte est environ deux fois plus intense que le plaisir d'un gain équivalent. » — coefficient absent des six pages consultées.</w:t>
+      </w:r>
+    </w:p>
+    <w:p>
+      <w:pPr>
+        <w:spacing w:after="40" w:before="60"/>
+      </w:pPr>
+      <w:r>
+        <w:rPr>
+          <w:rFonts w:ascii="Times New Roman" w:cs="Times New Roman" w:eastAsia="Times New Roman" w:hAnsi="Times New Roman"/>
+          <w:color w:val="1F2937"/>
+          <w:sz w:val="22"/>
+          <w:szCs w:val="22"/>
+        </w:rPr>
+        <w:t xml:space="preserve">• Corrigé de la situation A : « aversion aux pertes (le prix d'ancrage de 200 € bloque la décision rationnelle de réallouer) » — un seul biais admis, expliqué par un autre.</w:t>
+      </w:r>
+    </w:p>
+    <w:p>
+      <w:pPr>
+        <w:spacing w:after="40" w:before="60"/>
+      </w:pPr>
+      <w:r>
+        <w:rPr>
+          <w:rFonts w:ascii="Times New Roman" w:cs="Times New Roman" w:eastAsia="Times New Roman" w:hAnsi="Times New Roman"/>
+          <w:color w:val="1F2937"/>
+          <w:sz w:val="22"/>
+          <w:szCs w:val="22"/>
+        </w:rPr>
+        <w:t xml:space="preserve">• Piste de corrigé : « Les biais les plus courants en France, selon la littérature sur le comportement des épargnants (IEFP), sont l'aversion aux pertes (surtout chez les épargnants peu familiers des marchés), le biais de confirmation (sur les supports les plus médiatisés), et l'effet moutonnier lors des phases de marché extrêmes. » — la page IEFP ne dit ni la hiérarchie, ni les précisions, ni « moutonnier ».</w:t>
+      </w:r>
+    </w:p>
+    <w:p>
+      <w:pPr>
+        <w:spacing w:after="40" w:before="60"/>
+      </w:pPr>
+      <w:r>
+        <w:rPr>
+          <w:rFonts w:ascii="Times New Roman" w:cs="Times New Roman" w:eastAsia="Times New Roman" w:hAnsi="Times New Roman"/>
+          <w:color w:val="1F2937"/>
+          <w:sz w:val="22"/>
+          <w:szCs w:val="22"/>
+        </w:rPr>
+        <w:t xml:space="preserve">• Ressource 4 : « présentation pédagogique des 7 biais principaux avec exemples concrets » — six sur sept coïncident.</w:t>
       </w:r>
     </w:p>
     <w:sectPr>

</xml_diff>